<commit_message>
Rebuild hub-next as a dynamic, database-backed replacement for the Docusaurus hub
Pixel-matches the Docusaurus chrome (navbar, footer, sidebar, breadcrumbs, TOC)
that the previous hub-next attempt was missing, while moving Market Map
Directory and company research screens off static files/localStorage onto
Firestore so they're actually editable. Auth is deliberately left unwired
(middleware.js is a no-op) until this is deployed and tested live.
</commit_message>
<xml_diff>
--- a/hub-next/public/research/companies/ollin.docx
+++ b/hub-next/public/research/companies/ollin.docx
@@ -272,7 +272,47 @@
                 <w:color w:val="3C3C3C"/>
                 <w:sz w:val="18"/>
               </w:rPr>
-              <w:t>Ollin’s $330 million Series B was co-led by TCGX and ARCH Venture Partners, and the company explicitly says TCGX was a new investor while ARCH was a founding investor. That fits a strong new-money top-tier lead/co-lead dynamic, though ARCH appears to be an inside/founding investor rather than both leads being entirely new money.[3][2]</w:t>
+              <w:t xml:space="preserve">Ollin Biosciences raised an oversubscribed $330M </w:t>
+            </w:r>
+            <w:r>
+              <w:rPr>
+                <w:rFonts w:ascii="Sora" w:hAnsi="Sora"/>
+                <w:b/>
+                <w:caps w:val="0"/>
+                <w:color w:val="3C3C3C"/>
+                <w:sz w:val="18"/>
+              </w:rPr>
+              <w:t>Series B</w:t>
+            </w:r>
+            <w:r>
+              <w:rPr>
+                <w:rFonts w:ascii="Sora" w:hAnsi="Sora"/>
+                <w:b w:val="0"/>
+                <w:caps w:val="0"/>
+                <w:color w:val="3C3C3C"/>
+                <w:sz w:val="18"/>
+              </w:rPr>
+              <w:t xml:space="preserve"> round co-led by founding investor ARCH Venture Partners and </w:t>
+            </w:r>
+            <w:r>
+              <w:rPr>
+                <w:rFonts w:ascii="Sora" w:hAnsi="Sora"/>
+                <w:b/>
+                <w:caps w:val="0"/>
+                <w:color w:val="3C3C3C"/>
+                <w:sz w:val="18"/>
+              </w:rPr>
+              <w:t>new investor</w:t>
+            </w:r>
+            <w:r>
+              <w:rPr>
+                <w:rFonts w:ascii="Sora" w:hAnsi="Sora"/>
+                <w:b w:val="0"/>
+                <w:caps w:val="0"/>
+                <w:color w:val="3C3C3C"/>
+                <w:sz w:val="18"/>
+              </w:rPr>
+              <w:t xml:space="preserve"> TCGX, with a large healthcare-focused crossover and institutional syndicate including a16z Bio+Health, RA Capital, Blackstone, CPP Investments, and T. Rowe Price accounts.[1][4][9] ARCH is an existing insider while TCGX is a tier-1 crossover/late-stage investor joining as new money; this is a near–top-tier new-money Series B with a top-tier syndicate but not a purely new-money top-tier lead, so fits Score 3 rather than Score 4.[1][2][4]</w:t>
             </w:r>
           </w:p>
         </w:tc>
@@ -374,7 +414,27 @@
                 <w:color w:val="3C3C3C"/>
                 <w:sz w:val="18"/>
               </w:rPr>
-              <w:t>Ollin Biosciences is a clinical-stage ophthalmology/biopharma company focused on vision-threatening diseases and Phase 3 development, with no evidence that AI is a meaningful part of the product or value proposition.[3][2]</w:t>
+              <w:t xml:space="preserve">Ollin is described as a </w:t>
+            </w:r>
+            <w:r>
+              <w:rPr>
+                <w:rFonts w:ascii="Sora" w:hAnsi="Sora"/>
+                <w:b/>
+                <w:caps w:val="0"/>
+                <w:color w:val="3C3C3C"/>
+                <w:sz w:val="18"/>
+              </w:rPr>
+              <w:t>clinical-stage biopharmaceutical</w:t>
+            </w:r>
+            <w:r>
+              <w:rPr>
+                <w:rFonts w:ascii="Sora" w:hAnsi="Sora"/>
+                <w:b w:val="0"/>
+                <w:caps w:val="0"/>
+                <w:color w:val="3C3C3C"/>
+                <w:sz w:val="18"/>
+              </w:rPr>
+              <w:t xml:space="preserve"> company developing novel therapies for severe, vision-threatening ophthalmic diseases (wet AMD, DME, TED) via bispecific antibodies and biologics competing with drugs like Roche’s Vabysmo and Amgen’s Tepezza.[3][1] No sources mention machine learning, AI-enabled discovery, or an AI-centric product; this appears to be a traditional biotech, so AI Score is 1.[3][4]</w:t>
             </w:r>
           </w:p>
         </w:tc>
@@ -476,7 +536,27 @@
                 <w:color w:val="3C3C3C"/>
                 <w:sz w:val="18"/>
               </w:rPr>
-              <w:t>This is a biotech company, so the revenue/growth/NDR/LTV-CAC anchors are not disclosed in the available sources, and no operating metrics were found. With no evidence for the rubric’s fundamentals thresholds, this scores low by the prompt’s skepticism rule.[3][2]</w:t>
+              <w:t xml:space="preserve">Public information describes Ollin as a </w:t>
+            </w:r>
+            <w:r>
+              <w:rPr>
+                <w:rFonts w:ascii="Sora" w:hAnsi="Sora"/>
+                <w:b/>
+                <w:caps w:val="0"/>
+                <w:color w:val="3C3C3C"/>
+                <w:sz w:val="18"/>
+              </w:rPr>
+              <w:t>clinical-stage</w:t>
+            </w:r>
+            <w:r>
+              <w:rPr>
+                <w:rFonts w:ascii="Sora" w:hAnsi="Sora"/>
+                <w:b w:val="0"/>
+                <w:caps w:val="0"/>
+                <w:color w:val="3C3C3C"/>
+                <w:sz w:val="18"/>
+              </w:rPr>
+              <w:t xml:space="preserve"> biotech with its lead asset OLN324/IBI324 moving into global Phase 3 trials for DME and wet AMD in the second half of 2026, funded by the $330M Series B.[1][6][9] As typical for Phase 3 ophthalmology biotech, no revenue, growth, NDR, or LTV/CAC metrics are reported and the business is fundamentally pre-commercial and cash-burning; with no evidence of commercial scale (&gt; $25M revenue) or efficiency, this fits the Score 1 fundamentals bucket for this rubric.[1][3]</w:t>
             </w:r>
           </w:p>
         </w:tc>
@@ -578,7 +658,7 @@
                 <w:color w:val="3C3C3C"/>
                 <w:sz w:val="18"/>
               </w:rPr>
-              <w:t>The round is large and supports global Phase 3 studies for a late-stage ophthalmology asset, which implies meaningful upside if the program succeeds, but it is still clinical-stage biotech with substantial binary risk. That supports greater than 3x potential with some risk of capital loss rather than a near-certain 7x+ outcome.[3][2][6]</w:t>
+              <w:t>The $330M Series B supports late-stage global Phase 3 programs in large, well-validated indications (wet AMD and DME) where Ollin aims to challenge Roche’s Vabysmo with potentially best-in-class bispecific antibodies, in partnership with Innovent for China.[1][3][6][9] If Phase 3 data are positive, an exit via IPO or strategic sale to a large ophthalmology player (e.g., Roche, Regeneron, Novartis) could plausibly deliver &gt;3x outcomes from crossover entry, but there remains substantial clinical and regulatory risk typical of single-asset or concentrated biotech bets, so Score 3 (&gt;3x potential with meaningful capital-loss risk) is appropriate rather than Score 4.[1][4][6]</w:t>
             </w:r>
           </w:p>
         </w:tc>
@@ -680,7 +760,7 @@
                 <w:color w:val="3C3C3C"/>
                 <w:sz w:val="18"/>
               </w:rPr>
-              <w:t>The publicly available sources identify a large oversubscribed Series B co-led by institutional investors, but they do not disclose carry, fee, SPV structure, or time horizon. With insufficient data on economics, this fits the rubric’s lower-confidence middle band rather than a clean 0/10 SPV or better-than-0/10 outcome.[3][2]</w:t>
+              <w:t>Available coverage focuses on the size and investors in the oversubscribed $330M Series B and does not disclose valuation, liquidation preferences, or SPV economics for co-investors; ID8 would most likely access this through a standard 0/10 SPV or similar structure but that is not evidenced in public sources.[1][4][9] Given lack of specific term data but context of a competitive, top-tier crossover-led biotech round (which usually clears at market terms rather than punitive structures), a conservative midpoint Score 2 is appropriate rather than assuming 0/10, better-than-0/10, or high-fee carry without evidence.[1][5]</w:t>
             </w:r>
           </w:p>
         </w:tc>
@@ -722,7 +802,47 @@
           <w:color w:val="1A1A1A"/>
           <w:sz w:val="21"/>
         </w:rPr>
-        <w:t>The deal passes the stage and geography gate: it is a Series B and the company is headquartered in Austin, Texas. It partially aligns with ID8’s thesis because the round includes a genuine new-money Tier 1 lead in TCGX, but it also includes ARCH as a founding/inside investor, so this is not a pure first-time new-money Tier 1-led round. Overall this looks like a strong but not perfect fit: compelling lead quality and late-stage biotech upside, but no AI exposure and no disclosed operating metrics or terms.</w:t>
+        <w:t xml:space="preserve">Ollin Biosciences is an Austin-based, clinical-stage ophthalmology biotech raising a very large, oversubscribed </w:t>
+      </w:r>
+      <w:r>
+        <w:rPr>
+          <w:rFonts w:ascii="Sora" w:hAnsi="Sora"/>
+          <w:b/>
+          <w:caps w:val="0"/>
+          <w:color w:val="1A1A1A"/>
+          <w:sz w:val="21"/>
+        </w:rPr>
+        <w:t>Series B</w:t>
+      </w:r>
+      <w:r>
+        <w:rPr>
+          <w:rFonts w:ascii="Sora" w:hAnsi="Sora"/>
+          <w:b w:val="0"/>
+          <w:caps w:val="0"/>
+          <w:color w:val="1A1A1A"/>
+          <w:sz w:val="21"/>
+        </w:rPr>
+        <w:t xml:space="preserve"> led by insider ARCH Venture Partners and new-money tier-1 crossover TCGX, with a strong syndicate of a16z Bio+Health, RA Capital, Blackstone, CPP Investments, and T. Rowe Price accounts, which aligns well with ID8’s emphasis on new-money tier-1 leads but only partially, since one co-lead is an existing investor rather than purely new-money.[1][2][4][9] The company is pre-commercial and AI-light, but targets large, validated retinal markets with a Phase 3-ready asset, giving solid upside with material clinical risk; overall it fits ID8’s </w:t>
+      </w:r>
+      <w:r>
+        <w:rPr>
+          <w:rFonts w:ascii="Sora" w:hAnsi="Sora"/>
+          <w:b/>
+          <w:caps w:val="0"/>
+          <w:color w:val="1A1A1A"/>
+          <w:sz w:val="21"/>
+        </w:rPr>
+        <w:t>stage and geography gates</w:t>
+      </w:r>
+      <w:r>
+        <w:rPr>
+          <w:rFonts w:ascii="Sora" w:hAnsi="Sora"/>
+          <w:b w:val="0"/>
+          <w:caps w:val="0"/>
+          <w:color w:val="1A1A1A"/>
+          <w:sz w:val="21"/>
+        </w:rPr>
+        <w:t xml:space="preserve"> and broadly matches the thesis on round dynamics, while fundamentals and AI exposure are weak under this rubric.</w:t>
       </w:r>
     </w:p>
     <w:p>
@@ -737,7 +857,7 @@
           <w:color w:val="828282"/>
           <w:sz w:val="18"/>
         </w:rPr>
-        <w:t>Confidence: high</w:t>
+        <w:t>Confidence: medium</w:t>
       </w:r>
     </w:p>
     <w:sectPr>

</xml_diff>